<commit_message>
Inclusión readme y actualización fechas de planeador
</commit_message>
<xml_diff>
--- a/FTCOES-264 Pacto Pedagógico Back I.docx
+++ b/FTCOES-264 Pacto Pedagógico Back I.docx
@@ -1854,6 +1854,7 @@
         <w:rPr>
           <w:rFonts w:ascii="Arial" w:hAnsi="Arial" w:cs="Arial"/>
           <w:b/>
+          <w:bCs/>
           <w:sz w:val="22"/>
           <w:szCs w:val="22"/>
         </w:rPr>
@@ -1862,10 +1863,33 @@
         <w:rPr>
           <w:rFonts w:ascii="Arial" w:hAnsi="Arial" w:cs="Arial"/>
           <w:b/>
-          <w:sz w:val="22"/>
-          <w:szCs w:val="22"/>
-        </w:rPr>
-        <w:t>El uso del celular se encuentra permitido para responder a emergencias, fotografiar escenario de la clase.</w:t>
+          <w:bCs/>
+          <w:sz w:val="22"/>
+          <w:szCs w:val="22"/>
+        </w:rPr>
+        <w:t xml:space="preserve">El uso del celular se encuentra permitido para responder a emergencias, reuniones de </w:t>
+      </w:r>
+      <w:proofErr w:type="spellStart"/>
+      <w:r>
+        <w:rPr>
+          <w:rFonts w:ascii="Arial" w:hAnsi="Arial" w:cs="Arial"/>
+          <w:b/>
+          <w:bCs/>
+          <w:sz w:val="22"/>
+          <w:szCs w:val="22"/>
+        </w:rPr>
+        <w:t>teams</w:t>
+      </w:r>
+      <w:proofErr w:type="spellEnd"/>
+      <w:r>
+        <w:rPr>
+          <w:rFonts w:ascii="Arial" w:hAnsi="Arial" w:cs="Arial"/>
+          <w:b/>
+          <w:bCs/>
+          <w:sz w:val="22"/>
+          <w:szCs w:val="22"/>
+        </w:rPr>
+        <w:t>, fotografiar escenario de la clase. No se deben utilizar audífonos en clase sean inalámbricos o alámbricos.</w:t>
       </w:r>
     </w:p>
     <w:p>
@@ -1881,6 +1905,7 @@
         <w:rPr>
           <w:rFonts w:ascii="Arial" w:hAnsi="Arial" w:cs="Arial"/>
           <w:b/>
+          <w:bCs/>
           <w:sz w:val="22"/>
           <w:szCs w:val="22"/>
         </w:rPr>
@@ -1889,28 +1914,71 @@
         <w:rPr>
           <w:rFonts w:ascii="Arial" w:hAnsi="Arial" w:cs="Arial"/>
           <w:b/>
-          <w:sz w:val="22"/>
-          <w:szCs w:val="22"/>
-        </w:rPr>
-        <w:t>El descanso se encuentra pactado para las 4</w:t>
+          <w:bCs/>
+          <w:sz w:val="22"/>
+          <w:szCs w:val="22"/>
+        </w:rPr>
+        <w:t xml:space="preserve">El descanso se encuentra pactado para las </w:t>
       </w:r>
       <w:r>
         <w:rPr>
           <w:rFonts w:ascii="Arial" w:hAnsi="Arial" w:cs="Arial"/>
           <w:b/>
-          <w:sz w:val="22"/>
-          <w:szCs w:val="22"/>
-        </w:rPr>
-        <w:t>:0</w:t>
+          <w:bCs/>
+          <w:sz w:val="22"/>
+          <w:szCs w:val="22"/>
+        </w:rPr>
+        <w:t>7</w:t>
       </w:r>
       <w:r>
         <w:rPr>
           <w:rFonts w:ascii="Arial" w:hAnsi="Arial" w:cs="Arial"/>
           <w:b/>
-          <w:sz w:val="22"/>
-          <w:szCs w:val="22"/>
-        </w:rPr>
-        <w:t>0 pm</w:t>
+          <w:bCs/>
+          <w:sz w:val="22"/>
+          <w:szCs w:val="22"/>
+        </w:rPr>
+        <w:t>:</w:t>
+      </w:r>
+      <w:r>
+        <w:rPr>
+          <w:rFonts w:ascii="Arial" w:hAnsi="Arial" w:cs="Arial"/>
+          <w:b/>
+          <w:bCs/>
+          <w:sz w:val="22"/>
+          <w:szCs w:val="22"/>
+        </w:rPr>
+        <w:t>45</w:t>
+      </w:r>
+      <w:r>
+        <w:rPr>
+          <w:rFonts w:ascii="Arial" w:hAnsi="Arial" w:cs="Arial"/>
+          <w:b/>
+          <w:bCs/>
+          <w:sz w:val="22"/>
+          <w:szCs w:val="22"/>
+        </w:rPr>
+        <w:t xml:space="preserve"> </w:t>
+      </w:r>
+      <w:r>
+        <w:rPr>
+          <w:rFonts w:ascii="Arial" w:hAnsi="Arial" w:cs="Arial"/>
+          <w:b/>
+          <w:bCs/>
+          <w:sz w:val="22"/>
+          <w:szCs w:val="22"/>
+        </w:rPr>
+        <w:t>p</w:t>
+      </w:r>
+      <w:r>
+        <w:rPr>
+          <w:rFonts w:ascii="Arial" w:hAnsi="Arial" w:cs="Arial"/>
+          <w:b/>
+          <w:bCs/>
+          <w:sz w:val="22"/>
+          <w:szCs w:val="22"/>
+        </w:rPr>
+        <w:t>m</w:t>
       </w:r>
     </w:p>
     <w:p>
@@ -1926,6 +1994,7 @@
         <w:rPr>
           <w:rFonts w:ascii="Arial" w:hAnsi="Arial" w:cs="Arial"/>
           <w:b/>
+          <w:bCs/>
           <w:sz w:val="22"/>
           <w:szCs w:val="22"/>
         </w:rPr>
@@ -1934,6 +2003,7 @@
         <w:rPr>
           <w:rFonts w:ascii="Arial" w:hAnsi="Arial" w:cs="Arial"/>
           <w:b/>
+          <w:bCs/>
           <w:sz w:val="22"/>
           <w:szCs w:val="22"/>
         </w:rPr>
@@ -1953,6 +2023,7 @@
         <w:rPr>
           <w:rFonts w:ascii="Arial" w:hAnsi="Arial" w:cs="Arial"/>
           <w:b/>
+          <w:bCs/>
           <w:sz w:val="22"/>
           <w:szCs w:val="22"/>
         </w:rPr>
@@ -1961,6 +2032,7 @@
         <w:rPr>
           <w:rFonts w:ascii="Arial" w:hAnsi="Arial" w:cs="Arial"/>
           <w:b/>
+          <w:bCs/>
           <w:sz w:val="22"/>
           <w:szCs w:val="22"/>
         </w:rPr>
@@ -1980,19 +2052,11 @@
         <w:rPr>
           <w:rFonts w:ascii="Arial" w:hAnsi="Arial" w:cs="Arial"/>
           <w:b/>
-          <w:sz w:val="22"/>
-          <w:szCs w:val="22"/>
-        </w:rPr>
-      </w:pPr>
-      <w:r>
-        <w:rPr>
-          <w:rFonts w:ascii="Arial" w:hAnsi="Arial" w:cs="Arial"/>
-          <w:b/>
-          <w:sz w:val="22"/>
-          <w:szCs w:val="22"/>
-        </w:rPr>
-        <w:t>No se encuentran permitidos los juegos de manos.</w:t>
-      </w:r>
+          <w:bCs/>
+          <w:sz w:val="22"/>
+          <w:szCs w:val="22"/>
+        </w:rPr>
+      </w:pPr>
     </w:p>
     <w:p>
       <w:pPr>
@@ -2015,11 +2079,25 @@
         <w:rPr>
           <w:rFonts w:ascii="Arial" w:hAnsi="Arial" w:cs="Arial"/>
           <w:b/>
-          <w:sz w:val="22"/>
-          <w:szCs w:val="22"/>
-        </w:rPr>
-        <w:t xml:space="preserve">No se encuentra permitido la ejecución de juegos con los equipos en el aula de clase. </w:t>
+          <w:bCs/>
+          <w:sz w:val="22"/>
+          <w:szCs w:val="22"/>
+        </w:rPr>
+        <w:t xml:space="preserve">Las constancias o soporte para el docente se deben de enviar únicamente al correo </w:t>
       </w:r>
+      <w:hyperlink r:id="rId13" w:history="1">
+        <w:r>
+          <w:rPr>
+            <w:rStyle w:val="Hipervnculo"/>
+            <w:rFonts w:ascii="Arial" w:hAnsi="Arial" w:cs="Arial"/>
+            <w:b/>
+            <w:bCs/>
+            <w:sz w:val="22"/>
+            <w:szCs w:val="22"/>
+          </w:rPr>
+          <w:t>syosa@cesde.net</w:t>
+        </w:r>
+      </w:hyperlink>
     </w:p>
     <w:p>
       <w:pPr>
@@ -2034,48 +2112,11 @@
         <w:rPr>
           <w:rFonts w:ascii="Arial" w:hAnsi="Arial" w:cs="Arial"/>
           <w:b/>
-          <w:sz w:val="22"/>
-          <w:szCs w:val="22"/>
-        </w:rPr>
-      </w:pPr>
-      <w:r>
-        <w:rPr>
-          <w:rFonts w:ascii="Arial" w:hAnsi="Arial" w:cs="Arial"/>
-          <w:b/>
-          <w:sz w:val="22"/>
-          <w:szCs w:val="22"/>
-        </w:rPr>
-        <w:t xml:space="preserve">No se encuentra permitido el consumo de plataformas </w:t>
-      </w:r>
-      <w:proofErr w:type="spellStart"/>
-      <w:r>
-        <w:rPr>
-          <w:rFonts w:ascii="Arial" w:hAnsi="Arial" w:cs="Arial"/>
-          <w:b/>
-          <w:sz w:val="22"/>
-          <w:szCs w:val="22"/>
-        </w:rPr>
-        <w:t>S</w:t>
-      </w:r>
-      <w:r>
-        <w:rPr>
-          <w:rFonts w:ascii="Arial" w:hAnsi="Arial" w:cs="Arial"/>
-          <w:b/>
-          <w:sz w:val="22"/>
-          <w:szCs w:val="22"/>
-        </w:rPr>
-        <w:t>treaming</w:t>
-      </w:r>
-      <w:proofErr w:type="spellEnd"/>
-      <w:r>
-        <w:rPr>
-          <w:rFonts w:ascii="Arial" w:hAnsi="Arial" w:cs="Arial"/>
-          <w:b/>
-          <w:sz w:val="22"/>
-          <w:szCs w:val="22"/>
-        </w:rPr>
-        <w:t xml:space="preserve">. </w:t>
-      </w:r>
+          <w:bCs/>
+          <w:sz w:val="22"/>
+          <w:szCs w:val="22"/>
+        </w:rPr>
+      </w:pPr>
     </w:p>
     <w:p>
       <w:pPr>
@@ -2090,8 +2131,364 @@
         <w:rPr>
           <w:rFonts w:ascii="Arial" w:hAnsi="Arial" w:cs="Arial"/>
           <w:b/>
-          <w:sz w:val="22"/>
-          <w:szCs w:val="22"/>
+          <w:bCs/>
+          <w:sz w:val="22"/>
+          <w:szCs w:val="22"/>
+        </w:rPr>
+      </w:pPr>
+      <w:proofErr w:type="gramStart"/>
+      <w:r>
+        <w:rPr>
+          <w:rFonts w:ascii="Arial" w:hAnsi="Arial" w:cs="Arial"/>
+          <w:b/>
+          <w:bCs/>
+          <w:sz w:val="22"/>
+          <w:szCs w:val="22"/>
+        </w:rPr>
+        <w:t>Las entregas de los momentos evaluativos será</w:t>
+      </w:r>
+      <w:proofErr w:type="gramEnd"/>
+      <w:r>
+        <w:rPr>
+          <w:rFonts w:ascii="Arial" w:hAnsi="Arial" w:cs="Arial"/>
+          <w:b/>
+          <w:bCs/>
+          <w:sz w:val="22"/>
+          <w:szCs w:val="22"/>
+        </w:rPr>
+        <w:t xml:space="preserve"> a través de:</w:t>
+      </w:r>
+    </w:p>
+    <w:p>
+      <w:pPr>
+        <w:pBdr>
+          <w:top w:val="single" w:sz="4" w:space="1" w:color="auto"/>
+          <w:left w:val="single" w:sz="4" w:space="0" w:color="auto"/>
+          <w:bottom w:val="single" w:sz="4" w:space="1" w:color="auto"/>
+          <w:right w:val="single" w:sz="4" w:space="4" w:color="auto"/>
+        </w:pBdr>
+        <w:spacing w:line="276" w:lineRule="auto"/>
+        <w:jc w:val="both"/>
+        <w:rPr>
+          <w:rFonts w:ascii="Arial" w:hAnsi="Arial" w:cs="Arial"/>
+          <w:b/>
+          <w:sz w:val="22"/>
+          <w:szCs w:val="22"/>
+        </w:rPr>
+      </w:pPr>
+      <w:hyperlink r:id="rId14" w:history="1">
+        <w:r>
+          <w:rPr>
+            <w:rStyle w:val="Hipervnculo"/>
+            <w:rFonts w:ascii="Arial" w:hAnsi="Arial" w:cs="Arial"/>
+            <w:b/>
+            <w:sz w:val="22"/>
+            <w:szCs w:val="22"/>
+          </w:rPr>
+          <w:t>https://forms.office.com/r/ZpqVrsuMKi?origin=lprLink</w:t>
+        </w:r>
+      </w:hyperlink>
+    </w:p>
+    <w:p>
+      <w:pPr>
+        <w:pBdr>
+          <w:top w:val="single" w:sz="4" w:space="1" w:color="auto"/>
+          <w:left w:val="single" w:sz="4" w:space="0" w:color="auto"/>
+          <w:bottom w:val="single" w:sz="4" w:space="1" w:color="auto"/>
+          <w:right w:val="single" w:sz="4" w:space="4" w:color="auto"/>
+        </w:pBdr>
+        <w:spacing w:line="276" w:lineRule="auto"/>
+        <w:jc w:val="both"/>
+        <w:rPr>
+          <w:rFonts w:ascii="Arial" w:hAnsi="Arial" w:cs="Arial"/>
+          <w:b/>
+          <w:bCs/>
+          <w:sz w:val="22"/>
+          <w:szCs w:val="22"/>
+        </w:rPr>
+      </w:pPr>
+    </w:p>
+    <w:p>
+      <w:pPr>
+        <w:pBdr>
+          <w:top w:val="single" w:sz="4" w:space="1" w:color="auto"/>
+          <w:left w:val="single" w:sz="4" w:space="0" w:color="auto"/>
+          <w:bottom w:val="single" w:sz="4" w:space="1" w:color="auto"/>
+          <w:right w:val="single" w:sz="4" w:space="4" w:color="auto"/>
+        </w:pBdr>
+        <w:spacing w:line="276" w:lineRule="auto"/>
+        <w:jc w:val="both"/>
+        <w:rPr>
+          <w:rFonts w:ascii="Arial" w:hAnsi="Arial" w:cs="Arial"/>
+          <w:b/>
+          <w:bCs/>
+          <w:sz w:val="22"/>
+          <w:szCs w:val="22"/>
+        </w:rPr>
+      </w:pPr>
+      <w:r>
+        <w:rPr>
+          <w:rFonts w:ascii="Arial" w:hAnsi="Arial" w:cs="Arial"/>
+          <w:b/>
+          <w:bCs/>
+          <w:sz w:val="22"/>
+          <w:szCs w:val="22"/>
+        </w:rPr>
+        <w:t>Se dispone de un repositorio, que contiene la información de las guías informativas, proyecto integrador y ejercicios realizados en clase, para que el estudiante las pueda usar fuera de clase:</w:t>
+      </w:r>
+    </w:p>
+    <w:p>
+      <w:pPr>
+        <w:pBdr>
+          <w:top w:val="single" w:sz="4" w:space="1" w:color="auto"/>
+          <w:left w:val="single" w:sz="4" w:space="0" w:color="auto"/>
+          <w:bottom w:val="single" w:sz="4" w:space="1" w:color="auto"/>
+          <w:right w:val="single" w:sz="4" w:space="4" w:color="auto"/>
+        </w:pBdr>
+        <w:spacing w:line="276" w:lineRule="auto"/>
+        <w:jc w:val="both"/>
+        <w:rPr>
+          <w:rFonts w:ascii="Arial" w:hAnsi="Arial" w:cs="Arial"/>
+          <w:b/>
+          <w:sz w:val="22"/>
+          <w:szCs w:val="22"/>
+        </w:rPr>
+      </w:pPr>
+      <w:hyperlink r:id="rId15" w:history="1">
+        <w:r>
+          <w:rPr>
+            <w:rStyle w:val="Hipervnculo"/>
+            <w:rFonts w:ascii="Arial" w:hAnsi="Arial" w:cs="Arial"/>
+            <w:b/>
+            <w:sz w:val="22"/>
+            <w:szCs w:val="22"/>
+          </w:rPr>
+          <w:t>https://github.com/ProSachi/Med-s1-martes-615-backendI-209</w:t>
+        </w:r>
+      </w:hyperlink>
+    </w:p>
+    <w:p>
+      <w:pPr>
+        <w:pBdr>
+          <w:top w:val="single" w:sz="4" w:space="1" w:color="auto"/>
+          <w:left w:val="single" w:sz="4" w:space="0" w:color="auto"/>
+          <w:bottom w:val="single" w:sz="4" w:space="1" w:color="auto"/>
+          <w:right w:val="single" w:sz="4" w:space="4" w:color="auto"/>
+        </w:pBdr>
+        <w:spacing w:line="276" w:lineRule="auto"/>
+        <w:jc w:val="both"/>
+        <w:rPr>
+          <w:rFonts w:ascii="Arial" w:hAnsi="Arial" w:cs="Arial"/>
+          <w:b/>
+          <w:bCs/>
+          <w:sz w:val="22"/>
+          <w:szCs w:val="22"/>
+        </w:rPr>
+      </w:pPr>
+    </w:p>
+    <w:p>
+      <w:pPr>
+        <w:pBdr>
+          <w:top w:val="single" w:sz="4" w:space="1" w:color="auto"/>
+          <w:left w:val="single" w:sz="4" w:space="0" w:color="auto"/>
+          <w:bottom w:val="single" w:sz="4" w:space="1" w:color="auto"/>
+          <w:right w:val="single" w:sz="4" w:space="4" w:color="auto"/>
+        </w:pBdr>
+        <w:spacing w:line="276" w:lineRule="auto"/>
+        <w:jc w:val="both"/>
+        <w:rPr>
+          <w:rFonts w:ascii="Arial" w:hAnsi="Arial" w:cs="Arial"/>
+          <w:b/>
+          <w:bCs/>
+          <w:sz w:val="22"/>
+          <w:szCs w:val="22"/>
+        </w:rPr>
+      </w:pPr>
+      <w:r>
+        <w:rPr>
+          <w:rFonts w:ascii="Arial" w:hAnsi="Arial" w:cs="Arial"/>
+          <w:b/>
+          <w:bCs/>
+          <w:sz w:val="22"/>
+          <w:szCs w:val="22"/>
+        </w:rPr>
+        <w:t>Se socializa la información de platzi y se informa que será recolectado el certificado en la semana 6.</w:t>
+      </w:r>
+      <w:r>
+        <w:rPr>
+          <w:rFonts w:ascii="Arial" w:hAnsi="Arial" w:cs="Arial"/>
+          <w:b/>
+          <w:bCs/>
+          <w:sz w:val="22"/>
+          <w:szCs w:val="22"/>
+        </w:rPr>
+        <w:t xml:space="preserve"> Representa el 50% de la nota del primer momento.</w:t>
+      </w:r>
+    </w:p>
+    <w:p>
+      <w:pPr>
+        <w:pBdr>
+          <w:top w:val="single" w:sz="4" w:space="1" w:color="auto"/>
+          <w:left w:val="single" w:sz="4" w:space="0" w:color="auto"/>
+          <w:bottom w:val="single" w:sz="4" w:space="1" w:color="auto"/>
+          <w:right w:val="single" w:sz="4" w:space="4" w:color="auto"/>
+        </w:pBdr>
+        <w:spacing w:line="276" w:lineRule="auto"/>
+        <w:jc w:val="both"/>
+        <w:rPr>
+          <w:rFonts w:ascii="Arial" w:hAnsi="Arial" w:cs="Arial"/>
+          <w:b/>
+          <w:sz w:val="22"/>
+          <w:szCs w:val="22"/>
+        </w:rPr>
+      </w:pPr>
+      <w:hyperlink r:id="rId16" w:history="1">
+        <w:r>
+          <w:rPr>
+            <w:rStyle w:val="Hipervnculo"/>
+            <w:rFonts w:ascii="Arial" w:hAnsi="Arial" w:cs="Arial"/>
+            <w:b/>
+            <w:sz w:val="22"/>
+            <w:szCs w:val="22"/>
+          </w:rPr>
+          <w:t>https://platzi.com/cursos/java-sql/</w:t>
+        </w:r>
+      </w:hyperlink>
+    </w:p>
+    <w:p>
+      <w:pPr>
+        <w:pBdr>
+          <w:top w:val="single" w:sz="4" w:space="1" w:color="auto"/>
+          <w:left w:val="single" w:sz="4" w:space="0" w:color="auto"/>
+          <w:bottom w:val="single" w:sz="4" w:space="1" w:color="auto"/>
+          <w:right w:val="single" w:sz="4" w:space="4" w:color="auto"/>
+        </w:pBdr>
+        <w:spacing w:line="276" w:lineRule="auto"/>
+        <w:jc w:val="both"/>
+        <w:rPr>
+          <w:rFonts w:ascii="Arial" w:hAnsi="Arial" w:cs="Arial"/>
+          <w:b/>
+          <w:bCs/>
+          <w:sz w:val="22"/>
+          <w:szCs w:val="22"/>
+        </w:rPr>
+      </w:pPr>
+    </w:p>
+    <w:p>
+      <w:pPr>
+        <w:pBdr>
+          <w:top w:val="single" w:sz="4" w:space="1" w:color="auto"/>
+          <w:left w:val="single" w:sz="4" w:space="0" w:color="auto"/>
+          <w:bottom w:val="single" w:sz="4" w:space="1" w:color="auto"/>
+          <w:right w:val="single" w:sz="4" w:space="4" w:color="auto"/>
+        </w:pBdr>
+        <w:spacing w:line="276" w:lineRule="auto"/>
+        <w:jc w:val="both"/>
+        <w:rPr>
+          <w:rFonts w:ascii="Arial" w:hAnsi="Arial" w:cs="Arial"/>
+          <w:b/>
+          <w:sz w:val="22"/>
+          <w:szCs w:val="22"/>
+        </w:rPr>
+      </w:pPr>
+      <w:r>
+        <w:rPr>
+          <w:rFonts w:ascii="Arial" w:hAnsi="Arial" w:cs="Arial"/>
+          <w:b/>
+          <w:sz w:val="22"/>
+          <w:szCs w:val="22"/>
+        </w:rPr>
+        <w:t xml:space="preserve">Se socializa la plataforma de </w:t>
+      </w:r>
+      <w:proofErr w:type="spellStart"/>
+      <w:r>
+        <w:rPr>
+          <w:rFonts w:ascii="Arial" w:hAnsi="Arial" w:cs="Arial"/>
+          <w:b/>
+          <w:sz w:val="22"/>
+          <w:szCs w:val="22"/>
+        </w:rPr>
+        <w:t>slang</w:t>
+      </w:r>
+      <w:proofErr w:type="spellEnd"/>
+      <w:r>
+        <w:rPr>
+          <w:rFonts w:ascii="Arial" w:hAnsi="Arial" w:cs="Arial"/>
+          <w:b/>
+          <w:sz w:val="22"/>
+          <w:szCs w:val="22"/>
+        </w:rPr>
+        <w:t>, indicando que se deben realizar al menos 30 horas durante el submódulo.</w:t>
+      </w:r>
+      <w:r>
+        <w:rPr>
+          <w:rFonts w:ascii="Arial" w:hAnsi="Arial" w:cs="Arial"/>
+          <w:b/>
+          <w:sz w:val="22"/>
+          <w:szCs w:val="22"/>
+        </w:rPr>
+        <w:t xml:space="preserve"> Representa el 50% de la nota del 3 momento.</w:t>
+      </w:r>
+    </w:p>
+    <w:p>
+      <w:pPr>
+        <w:pBdr>
+          <w:top w:val="single" w:sz="4" w:space="1" w:color="auto"/>
+          <w:left w:val="single" w:sz="4" w:space="0" w:color="auto"/>
+          <w:bottom w:val="single" w:sz="4" w:space="1" w:color="auto"/>
+          <w:right w:val="single" w:sz="4" w:space="4" w:color="auto"/>
+        </w:pBdr>
+        <w:spacing w:line="276" w:lineRule="auto"/>
+        <w:jc w:val="both"/>
+        <w:rPr>
+          <w:rFonts w:ascii="Arial" w:hAnsi="Arial" w:cs="Arial"/>
+          <w:b/>
+          <w:sz w:val="22"/>
+          <w:szCs w:val="22"/>
+        </w:rPr>
+      </w:pPr>
+      <w:hyperlink r:id="rId17" w:history="1">
+        <w:r>
+          <w:rPr>
+            <w:rStyle w:val="Hipervnculo"/>
+            <w:rFonts w:ascii="Arial" w:hAnsi="Arial" w:cs="Arial"/>
+            <w:b/>
+            <w:sz w:val="22"/>
+            <w:szCs w:val="22"/>
+          </w:rPr>
+          <w:t>https://learn.slangapp.com/progress</w:t>
+        </w:r>
+      </w:hyperlink>
+    </w:p>
+    <w:p>
+      <w:pPr>
+        <w:pBdr>
+          <w:top w:val="single" w:sz="4" w:space="1" w:color="auto"/>
+          <w:left w:val="single" w:sz="4" w:space="0" w:color="auto"/>
+          <w:bottom w:val="single" w:sz="4" w:space="1" w:color="auto"/>
+          <w:right w:val="single" w:sz="4" w:space="4" w:color="auto"/>
+        </w:pBdr>
+        <w:spacing w:line="276" w:lineRule="auto"/>
+        <w:jc w:val="both"/>
+        <w:rPr>
+          <w:rFonts w:ascii="Arial" w:hAnsi="Arial" w:cs="Arial"/>
+          <w:b/>
+          <w:sz w:val="22"/>
+          <w:szCs w:val="22"/>
+        </w:rPr>
+      </w:pPr>
+    </w:p>
+    <w:p>
+      <w:pPr>
+        <w:spacing w:line="276" w:lineRule="auto"/>
+        <w:jc w:val="both"/>
+        <w:rPr>
+          <w:rFonts w:ascii="Arial" w:hAnsi="Arial" w:cs="Arial"/>
+          <w:b/>
+          <w:bCs/>
+          <w:sz w:val="22"/>
+          <w:szCs w:val="22"/>
+          <w:lang w:val="es-CO"/>
         </w:rPr>
       </w:pPr>
     </w:p>
@@ -2256,6 +2653,7 @@
                 <w:rFonts w:ascii="Arial" w:hAnsi="Arial" w:cs="Arial"/>
                 <w:b/>
               </w:rPr>
+              <w:lastRenderedPageBreak/>
               <w:t>Momento 1</w:t>
             </w:r>
           </w:p>
@@ -2282,7 +2680,7 @@
               <w:rPr>
                 <w:rFonts w:ascii="Arial" w:hAnsi="Arial" w:cs="Arial"/>
               </w:rPr>
-              <w:t>4</w:t>
+              <w:t>3</w:t>
             </w:r>
             <w:r>
               <w:rPr>
@@ -2294,13 +2692,19 @@
               <w:rPr>
                 <w:rFonts w:ascii="Arial" w:hAnsi="Arial" w:cs="Arial"/>
               </w:rPr>
-              <w:t>9</w:t>
+              <w:t>3</w:t>
             </w:r>
             <w:r>
               <w:rPr>
                 <w:rFonts w:ascii="Arial" w:hAnsi="Arial" w:cs="Arial"/>
               </w:rPr>
-              <w:t>/2025</w:t>
+              <w:t>/202</w:t>
+            </w:r>
+            <w:r>
+              <w:rPr>
+                <w:rFonts w:ascii="Arial" w:hAnsi="Arial" w:cs="Arial"/>
+              </w:rPr>
+              <w:t>6</w:t>
             </w:r>
           </w:p>
         </w:tc>
@@ -2338,35 +2742,73 @@
                 <w:rFonts w:ascii="Arial" w:hAnsi="Arial" w:cs="Arial"/>
               </w:rPr>
             </w:pPr>
+          </w:p>
+        </w:tc>
+      </w:tr>
+      <w:tr>
+        <w:tc>
+          <w:tcPr>
+            <w:tcW w:w="7371" w:type="dxa"/>
+          </w:tcPr>
+          <w:p>
+            <w:pPr>
+              <w:spacing w:line="276" w:lineRule="auto"/>
+              <w:jc w:val="both"/>
+              <w:rPr>
+                <w:rFonts w:ascii="Arial" w:hAnsi="Arial" w:cs="Arial"/>
+                <w:b/>
+              </w:rPr>
+            </w:pPr>
             <w:r>
               <w:rPr>
                 <w:rFonts w:ascii="Arial" w:hAnsi="Arial" w:cs="Arial"/>
-              </w:rPr>
-              <w:t>1</w:t>
+                <w:b/>
+              </w:rPr>
+              <w:t>Momento 2</w:t>
+            </w:r>
+          </w:p>
+        </w:tc>
+        <w:tc>
+          <w:tcPr>
+            <w:tcW w:w="2694" w:type="dxa"/>
+          </w:tcPr>
+          <w:p>
+            <w:pPr>
+              <w:spacing w:line="276" w:lineRule="auto"/>
+              <w:jc w:val="both"/>
+              <w:rPr>
+                <w:rFonts w:ascii="Arial" w:hAnsi="Arial" w:cs="Arial"/>
+              </w:rPr>
+            </w:pPr>
+            <w:r>
+              <w:rPr>
+                <w:rFonts w:ascii="Arial" w:hAnsi="Arial" w:cs="Arial"/>
+              </w:rPr>
+              <w:t>21</w:t>
             </w:r>
             <w:r>
               <w:rPr>
                 <w:rFonts w:ascii="Arial" w:hAnsi="Arial" w:cs="Arial"/>
               </w:rPr>
-              <w:t>1</w:t>
+              <w:t>/</w:t>
             </w:r>
             <w:r>
               <w:rPr>
                 <w:rFonts w:ascii="Arial" w:hAnsi="Arial" w:cs="Arial"/>
               </w:rPr>
-              <w:t>/0</w:t>
+              <w:t>04</w:t>
             </w:r>
             <w:r>
               <w:rPr>
                 <w:rFonts w:ascii="Arial" w:hAnsi="Arial" w:cs="Arial"/>
               </w:rPr>
-              <w:t>9</w:t>
+              <w:t>/202</w:t>
             </w:r>
             <w:r>
               <w:rPr>
                 <w:rFonts w:ascii="Arial" w:hAnsi="Arial" w:cs="Arial"/>
               </w:rPr>
-              <w:t>/2025</w:t>
+              <w:t>6</w:t>
             </w:r>
           </w:p>
         </w:tc>
@@ -2382,15 +2824,13 @@
               <w:jc w:val="both"/>
               <w:rPr>
                 <w:rFonts w:ascii="Arial" w:hAnsi="Arial" w:cs="Arial"/>
-                <w:b/>
               </w:rPr>
             </w:pPr>
             <w:r>
               <w:rPr>
                 <w:rFonts w:ascii="Arial" w:hAnsi="Arial" w:cs="Arial"/>
-                <w:b/>
-              </w:rPr>
-              <w:t>Momento 2</w:t>
+              </w:rPr>
+              <w:t>Plan de Mejoramiento</w:t>
             </w:r>
           </w:p>
         </w:tc>
@@ -2406,29 +2846,48 @@
                 <w:rFonts w:ascii="Arial" w:hAnsi="Arial" w:cs="Arial"/>
               </w:rPr>
             </w:pPr>
+          </w:p>
+        </w:tc>
+      </w:tr>
+      <w:tr>
+        <w:tc>
+          <w:tcPr>
+            <w:tcW w:w="7371" w:type="dxa"/>
+          </w:tcPr>
+          <w:p>
+            <w:pPr>
+              <w:spacing w:line="276" w:lineRule="auto"/>
+              <w:jc w:val="both"/>
+              <w:rPr>
+                <w:rFonts w:ascii="Arial" w:hAnsi="Arial" w:cs="Arial"/>
+              </w:rPr>
+            </w:pPr>
             <w:r>
               <w:rPr>
                 <w:rFonts w:ascii="Arial" w:hAnsi="Arial" w:cs="Arial"/>
-              </w:rPr>
-              <w:t>1</w:t>
+                <w:b/>
+              </w:rPr>
+              <w:t>Momento 3</w:t>
             </w:r>
+          </w:p>
+        </w:tc>
+        <w:tc>
+          <w:tcPr>
+            <w:tcW w:w="2694" w:type="dxa"/>
+          </w:tcPr>
+          <w:p>
+            <w:pPr>
+              <w:spacing w:line="276" w:lineRule="auto"/>
+              <w:jc w:val="both"/>
+              <w:rPr>
+                <w:rFonts w:ascii="Arial" w:hAnsi="Arial" w:cs="Arial"/>
+              </w:rPr>
+            </w:pPr>
             <w:r>
               <w:rPr>
                 <w:rFonts w:ascii="Arial" w:hAnsi="Arial" w:cs="Arial"/>
               </w:rPr>
-              <w:t>6</w:t>
-            </w:r>
-            <w:r>
-              <w:rPr>
-                <w:rFonts w:ascii="Arial" w:hAnsi="Arial" w:cs="Arial"/>
-              </w:rPr>
-              <w:t>/10</w:t>
-            </w:r>
-            <w:r>
-              <w:rPr>
-                <w:rFonts w:ascii="Arial" w:hAnsi="Arial" w:cs="Arial"/>
-              </w:rPr>
-              <w:t>/2025</w:t>
+              <w:t>25/05/2026</w:t>
             </w:r>
           </w:p>
         </w:tc>
@@ -2450,139 +2909,6 @@
               <w:rPr>
                 <w:rFonts w:ascii="Arial" w:hAnsi="Arial" w:cs="Arial"/>
               </w:rPr>
-              <w:t>Plan de Mejoramiento</w:t>
-            </w:r>
-          </w:p>
-        </w:tc>
-        <w:tc>
-          <w:tcPr>
-            <w:tcW w:w="2694" w:type="dxa"/>
-          </w:tcPr>
-          <w:p>
-            <w:pPr>
-              <w:spacing w:line="276" w:lineRule="auto"/>
-              <w:jc w:val="both"/>
-              <w:rPr>
-                <w:rFonts w:ascii="Arial" w:hAnsi="Arial" w:cs="Arial"/>
-              </w:rPr>
-            </w:pPr>
-            <w:r>
-              <w:rPr>
-                <w:rFonts w:ascii="Arial" w:hAnsi="Arial" w:cs="Arial"/>
-              </w:rPr>
-              <w:t>2</w:t>
-            </w:r>
-            <w:r>
-              <w:rPr>
-                <w:rFonts w:ascii="Arial" w:hAnsi="Arial" w:cs="Arial"/>
-              </w:rPr>
-              <w:t>3</w:t>
-            </w:r>
-            <w:r>
-              <w:rPr>
-                <w:rFonts w:ascii="Arial" w:hAnsi="Arial" w:cs="Arial"/>
-              </w:rPr>
-              <w:t>/</w:t>
-            </w:r>
-            <w:r>
-              <w:rPr>
-                <w:rFonts w:ascii="Arial" w:hAnsi="Arial" w:cs="Arial"/>
-              </w:rPr>
-              <w:t>10</w:t>
-            </w:r>
-            <w:r>
-              <w:rPr>
-                <w:rFonts w:ascii="Arial" w:hAnsi="Arial" w:cs="Arial"/>
-              </w:rPr>
-              <w:t>/2025</w:t>
-            </w:r>
-          </w:p>
-        </w:tc>
-      </w:tr>
-      <w:tr>
-        <w:tc>
-          <w:tcPr>
-            <w:tcW w:w="7371" w:type="dxa"/>
-          </w:tcPr>
-          <w:p>
-            <w:pPr>
-              <w:spacing w:line="276" w:lineRule="auto"/>
-              <w:jc w:val="both"/>
-              <w:rPr>
-                <w:rFonts w:ascii="Arial" w:hAnsi="Arial" w:cs="Arial"/>
-              </w:rPr>
-            </w:pPr>
-            <w:r>
-              <w:rPr>
-                <w:rFonts w:ascii="Arial" w:hAnsi="Arial" w:cs="Arial"/>
-                <w:b/>
-              </w:rPr>
-              <w:t>Momento 3</w:t>
-            </w:r>
-          </w:p>
-        </w:tc>
-        <w:tc>
-          <w:tcPr>
-            <w:tcW w:w="2694" w:type="dxa"/>
-          </w:tcPr>
-          <w:p>
-            <w:pPr>
-              <w:spacing w:line="276" w:lineRule="auto"/>
-              <w:jc w:val="both"/>
-              <w:rPr>
-                <w:rFonts w:ascii="Arial" w:hAnsi="Arial" w:cs="Arial"/>
-              </w:rPr>
-            </w:pPr>
-            <w:r>
-              <w:rPr>
-                <w:rFonts w:ascii="Arial" w:hAnsi="Arial" w:cs="Arial"/>
-              </w:rPr>
-              <w:t>1</w:t>
-            </w:r>
-            <w:r>
-              <w:rPr>
-                <w:rFonts w:ascii="Arial" w:hAnsi="Arial" w:cs="Arial"/>
-              </w:rPr>
-              <w:t>3</w:t>
-            </w:r>
-            <w:r>
-              <w:rPr>
-                <w:rFonts w:ascii="Arial" w:hAnsi="Arial" w:cs="Arial"/>
-              </w:rPr>
-              <w:t>/1</w:t>
-            </w:r>
-            <w:r>
-              <w:rPr>
-                <w:rFonts w:ascii="Arial" w:hAnsi="Arial" w:cs="Arial"/>
-              </w:rPr>
-              <w:t>1</w:t>
-            </w:r>
-            <w:r>
-              <w:rPr>
-                <w:rFonts w:ascii="Arial" w:hAnsi="Arial" w:cs="Arial"/>
-              </w:rPr>
-              <w:t>/2025</w:t>
-            </w:r>
-          </w:p>
-        </w:tc>
-      </w:tr>
-      <w:tr>
-        <w:tc>
-          <w:tcPr>
-            <w:tcW w:w="7371" w:type="dxa"/>
-          </w:tcPr>
-          <w:p>
-            <w:pPr>
-              <w:spacing w:line="276" w:lineRule="auto"/>
-              <w:jc w:val="both"/>
-              <w:rPr>
-                <w:rFonts w:ascii="Arial" w:hAnsi="Arial" w:cs="Arial"/>
-              </w:rPr>
-            </w:pPr>
-            <w:r>
-              <w:rPr>
-                <w:rFonts w:ascii="Arial" w:hAnsi="Arial" w:cs="Arial"/>
-              </w:rPr>
               <w:t>Plan de mejoramiento</w:t>
             </w:r>
           </w:p>
@@ -2599,24 +2925,6 @@
                 <w:rFonts w:ascii="Arial" w:hAnsi="Arial" w:cs="Arial"/>
               </w:rPr>
             </w:pPr>
-            <w:r>
-              <w:rPr>
-                <w:rFonts w:ascii="Arial" w:hAnsi="Arial" w:cs="Arial"/>
-              </w:rPr>
-              <w:t>1</w:t>
-            </w:r>
-            <w:r>
-              <w:rPr>
-                <w:rFonts w:ascii="Arial" w:hAnsi="Arial" w:cs="Arial"/>
-              </w:rPr>
-              <w:t>3</w:t>
-            </w:r>
-            <w:r>
-              <w:rPr>
-                <w:rFonts w:ascii="Arial" w:hAnsi="Arial" w:cs="Arial"/>
-              </w:rPr>
-              <w:t>/11/2025</w:t>
-            </w:r>
           </w:p>
         </w:tc>
       </w:tr>
@@ -2837,7 +3145,6 @@
         <w:tc>
           <w:tcPr>
             <w:tcW w:w="1134" w:type="dxa"/>
-            <w:shd w:val="clear" w:color="auto" w:fill="auto"/>
             <w:vAlign w:val="center"/>
           </w:tcPr>
           <w:p>
@@ -2865,7 +3172,6 @@
         <w:tc>
           <w:tcPr>
             <w:tcW w:w="2977" w:type="dxa"/>
-            <w:shd w:val="clear" w:color="auto" w:fill="auto"/>
             <w:vAlign w:val="center"/>
           </w:tcPr>
           <w:p>
@@ -3001,7 +3307,6 @@
                 <w:sz w:val="18"/>
                 <w:szCs w:val="18"/>
               </w:rPr>
-              <w:lastRenderedPageBreak/>
               <w:t>Juan Diego Ruiz Roldan</w:t>
             </w:r>
           </w:p>
@@ -3009,7 +3314,6 @@
         <w:tc>
           <w:tcPr>
             <w:tcW w:w="3402" w:type="dxa"/>
-            <w:shd w:val="clear" w:color="auto" w:fill="auto"/>
             <w:vAlign w:val="center"/>
           </w:tcPr>
           <w:p>
@@ -3033,7 +3337,6 @@
                 <w:sz w:val="18"/>
                 <w:szCs w:val="18"/>
               </w:rPr>
-              <w:lastRenderedPageBreak/>
               <w:t>Paula Andrea Restrepo</w:t>
             </w:r>
           </w:p>
@@ -3120,7 +3423,6 @@
                 <w:sz w:val="18"/>
                 <w:szCs w:val="18"/>
               </w:rPr>
-              <w:lastRenderedPageBreak/>
               <w:t>William Felipe Palacio Villa</w:t>
             </w:r>
           </w:p>
@@ -3152,7 +3454,6 @@
         <w:tc>
           <w:tcPr>
             <w:tcW w:w="2455" w:type="dxa"/>
-            <w:shd w:val="clear" w:color="auto" w:fill="auto"/>
             <w:vAlign w:val="center"/>
           </w:tcPr>
           <w:p>
@@ -3178,7 +3479,6 @@
                 <w:szCs w:val="18"/>
                 <w:lang w:val="es-ES"/>
               </w:rPr>
-              <w:lastRenderedPageBreak/>
               <w:t xml:space="preserve">Rober De </w:t>
             </w:r>
             <w:proofErr w:type="spellStart"/>
@@ -3217,7 +3517,6 @@
         <w:tc>
           <w:tcPr>
             <w:tcW w:w="1134" w:type="dxa"/>
-            <w:shd w:val="clear" w:color="auto" w:fill="auto"/>
             <w:vAlign w:val="center"/>
           </w:tcPr>
           <w:p>
@@ -3245,7 +3544,6 @@
         <w:tc>
           <w:tcPr>
             <w:tcW w:w="2977" w:type="dxa"/>
-            <w:shd w:val="clear" w:color="auto" w:fill="auto"/>
             <w:vAlign w:val="center"/>
           </w:tcPr>
           <w:p>
@@ -3276,7 +3574,6 @@
         <w:tc>
           <w:tcPr>
             <w:tcW w:w="3402" w:type="dxa"/>
-            <w:shd w:val="clear" w:color="auto" w:fill="auto"/>
             <w:vAlign w:val="center"/>
           </w:tcPr>
           <w:p>
@@ -3307,7 +3604,6 @@
         <w:tc>
           <w:tcPr>
             <w:tcW w:w="2455" w:type="dxa"/>
-            <w:shd w:val="clear" w:color="auto" w:fill="auto"/>
             <w:vAlign w:val="center"/>
           </w:tcPr>
           <w:p>
@@ -3340,7 +3636,6 @@
         <w:tc>
           <w:tcPr>
             <w:tcW w:w="1134" w:type="dxa"/>
-            <w:shd w:val="clear" w:color="auto" w:fill="auto"/>
             <w:vAlign w:val="center"/>
           </w:tcPr>
           <w:p>
@@ -3368,7 +3663,6 @@
         <w:tc>
           <w:tcPr>
             <w:tcW w:w="2977" w:type="dxa"/>
-            <w:shd w:val="clear" w:color="auto" w:fill="auto"/>
             <w:vAlign w:val="center"/>
           </w:tcPr>
           <w:p>
@@ -3496,7 +3790,6 @@
         <w:tc>
           <w:tcPr>
             <w:tcW w:w="3402" w:type="dxa"/>
-            <w:shd w:val="clear" w:color="auto" w:fill="auto"/>
             <w:vAlign w:val="center"/>
           </w:tcPr>
           <w:p>
@@ -3585,7 +3878,6 @@
         <w:tc>
           <w:tcPr>
             <w:tcW w:w="2455" w:type="dxa"/>
-            <w:shd w:val="clear" w:color="auto" w:fill="auto"/>
             <w:vAlign w:val="center"/>
           </w:tcPr>
           <w:p>
@@ -3702,7 +3994,6 @@
         <w:tc>
           <w:tcPr>
             <w:tcW w:w="463" w:type="dxa"/>
-            <w:shd w:val="clear" w:color="auto" w:fill="auto"/>
             <w:vAlign w:val="center"/>
           </w:tcPr>
           <w:p>
@@ -3731,7 +4022,6 @@
         <w:tc>
           <w:tcPr>
             <w:tcW w:w="1335" w:type="dxa"/>
-            <w:shd w:val="clear" w:color="auto" w:fill="auto"/>
             <w:vAlign w:val="center"/>
           </w:tcPr>
           <w:p>
@@ -3756,7 +4046,6 @@
         <w:tc>
           <w:tcPr>
             <w:tcW w:w="5383" w:type="dxa"/>
-            <w:shd w:val="clear" w:color="auto" w:fill="auto"/>
             <w:vAlign w:val="center"/>
           </w:tcPr>
           <w:p>
@@ -3781,7 +4070,6 @@
         <w:tc>
           <w:tcPr>
             <w:tcW w:w="1207" w:type="dxa"/>
-            <w:shd w:val="clear" w:color="auto" w:fill="auto"/>
             <w:vAlign w:val="center"/>
           </w:tcPr>
           <w:p>
@@ -3837,7 +4125,6 @@
         <w:tc>
           <w:tcPr>
             <w:tcW w:w="463" w:type="dxa"/>
-            <w:shd w:val="clear" w:color="auto" w:fill="auto"/>
             <w:vAlign w:val="center"/>
           </w:tcPr>
           <w:p>
@@ -3862,7 +4149,6 @@
         <w:tc>
           <w:tcPr>
             <w:tcW w:w="1335" w:type="dxa"/>
-            <w:shd w:val="clear" w:color="auto" w:fill="auto"/>
             <w:vAlign w:val="center"/>
           </w:tcPr>
           <w:p>
@@ -3887,7 +4173,6 @@
         <w:tc>
           <w:tcPr>
             <w:tcW w:w="5383" w:type="dxa"/>
-            <w:shd w:val="clear" w:color="auto" w:fill="auto"/>
             <w:vAlign w:val="center"/>
           </w:tcPr>
           <w:p>
@@ -3937,7 +4222,6 @@
         <w:tc>
           <w:tcPr>
             <w:tcW w:w="1207" w:type="dxa"/>
-            <w:shd w:val="clear" w:color="auto" w:fill="auto"/>
             <w:vAlign w:val="center"/>
           </w:tcPr>
           <w:p>
@@ -3992,7 +4276,6 @@
         <w:tc>
           <w:tcPr>
             <w:tcW w:w="463" w:type="dxa"/>
-            <w:shd w:val="clear" w:color="auto" w:fill="auto"/>
             <w:vAlign w:val="center"/>
           </w:tcPr>
           <w:p>
@@ -4010,7 +4293,6 @@
         <w:tc>
           <w:tcPr>
             <w:tcW w:w="1335" w:type="dxa"/>
-            <w:shd w:val="clear" w:color="auto" w:fill="auto"/>
             <w:vAlign w:val="center"/>
           </w:tcPr>
           <w:p>
@@ -4028,7 +4310,6 @@
         <w:tc>
           <w:tcPr>
             <w:tcW w:w="5383" w:type="dxa"/>
-            <w:shd w:val="clear" w:color="auto" w:fill="auto"/>
             <w:vAlign w:val="center"/>
           </w:tcPr>
           <w:p>
@@ -4048,7 +4329,6 @@
         <w:tc>
           <w:tcPr>
             <w:tcW w:w="1207" w:type="dxa"/>
-            <w:shd w:val="clear" w:color="auto" w:fill="auto"/>
             <w:vAlign w:val="center"/>
           </w:tcPr>
           <w:p>
@@ -4087,7 +4367,6 @@
         <w:tc>
           <w:tcPr>
             <w:tcW w:w="463" w:type="dxa"/>
-            <w:shd w:val="clear" w:color="auto" w:fill="auto"/>
             <w:vAlign w:val="center"/>
           </w:tcPr>
           <w:p>
@@ -4105,7 +4384,6 @@
         <w:tc>
           <w:tcPr>
             <w:tcW w:w="1335" w:type="dxa"/>
-            <w:shd w:val="clear" w:color="auto" w:fill="auto"/>
             <w:vAlign w:val="center"/>
           </w:tcPr>
           <w:p>
@@ -4123,7 +4401,6 @@
         <w:tc>
           <w:tcPr>
             <w:tcW w:w="5383" w:type="dxa"/>
-            <w:shd w:val="clear" w:color="auto" w:fill="auto"/>
             <w:vAlign w:val="center"/>
           </w:tcPr>
           <w:p>
@@ -4143,7 +4420,6 @@
         <w:tc>
           <w:tcPr>
             <w:tcW w:w="1207" w:type="dxa"/>
-            <w:shd w:val="clear" w:color="auto" w:fill="auto"/>
             <w:vAlign w:val="center"/>
           </w:tcPr>
           <w:p>
@@ -4189,8 +4465,8 @@
       </w:pPr>
     </w:p>
     <w:sectPr>
-      <w:headerReference w:type="default" r:id="rId13"/>
-      <w:footerReference w:type="default" r:id="rId14"/>
+      <w:headerReference w:type="default" r:id="rId18"/>
+      <w:footerReference w:type="default" r:id="rId19"/>
       <w:pgSz w:w="12242" w:h="15842" w:code="1"/>
       <w:pgMar w:top="1134" w:right="902" w:bottom="1134" w:left="1418" w:header="851" w:footer="851" w:gutter="0"/>
       <w:cols w:space="720"/>
@@ -10642,7 +10918,6 @@
   <w:style w:type="character" w:default="1" w:styleId="Fuentedeprrafopredeter">
     <w:name w:val="Default Paragraph Font"/>
     <w:uiPriority w:val="1"/>
-    <w:semiHidden/>
     <w:unhideWhenUsed/>
   </w:style>
   <w:style w:type="table" w:default="1" w:styleId="Tablanormal">
@@ -11003,6 +11278,18 @@
       <w:lang w:eastAsia="es-ES"/>
     </w:rPr>
   </w:style>
+  <w:style w:type="character" w:styleId="Mencinsinresolver">
+    <w:name w:val="Unresolved Mention"/>
+    <w:basedOn w:val="Fuentedeprrafopredeter"/>
+    <w:uiPriority w:val="99"/>
+    <w:semiHidden/>
+    <w:unhideWhenUsed/>
+    <w:rsid w:val="009F0EE9"/>
+    <w:rPr>
+      <w:color w:val="605E5C"/>
+      <w:shd w:val="clear" w:color="auto" w:fill="E1DFDD"/>
+    </w:rPr>
+  </w:style>
 </w:styles>
 </file>
 
@@ -11302,26 +11589,10 @@
 </file>
 
 <file path=customXml/item1.xml><?xml version="1.0" encoding="utf-8"?>
-<p:properties xmlns:p="http://schemas.microsoft.com/office/2006/metadata/properties" xmlns:xsi="http://www.w3.org/2001/XMLSchema-instance" xmlns:pc="http://schemas.microsoft.com/office/infopath/2007/PartnerControls">
-  <documentManagement>
-    <lcf76f155ced4ddcb4097134ff3c332f xmlns="7f48dc74-810e-4597-a58e-28cb4ccb6405">
-      <Terms xmlns="http://schemas.microsoft.com/office/infopath/2007/PartnerControls"/>
-    </lcf76f155ced4ddcb4097134ff3c332f>
-    <TaxCatchAll xmlns="cfbdc990-d511-4af6-b9b1-fc96925cdde4" xsi:nil="true"/>
-  </documentManagement>
-</p:properties>
+<b:Sources xmlns:b="http://schemas.openxmlformats.org/officeDocument/2006/bibliography" xmlns="http://schemas.openxmlformats.org/officeDocument/2006/bibliography" SelectedStyle="\APASixthEditionOfficeOnline.xsl" StyleName="APA" Version="6"/>
 </file>
 
 <file path=customXml/item2.xml><?xml version="1.0" encoding="utf-8"?>
-<?mso-contentType ?>
-<FormTemplates xmlns="http://schemas.microsoft.com/sharepoint/v3/contenttype/forms">
-  <Display>DocumentLibraryForm</Display>
-  <Edit>DocumentLibraryForm</Edit>
-  <New>DocumentLibraryForm</New>
-</FormTemplates>
-</file>
-
-<file path=customXml/item3.xml><?xml version="1.0" encoding="utf-8"?>
 <ct:contentTypeSchema xmlns:ct="http://schemas.microsoft.com/office/2006/metadata/contentType" xmlns:ma="http://schemas.microsoft.com/office/2006/metadata/properties/metaAttributes" ct:_="" ma:_="" ma:contentTypeName="Documento" ma:contentTypeID="0x01010083AF92C53C90D641BDD84C8B6D931CAF" ma:contentTypeVersion="14" ma:contentTypeDescription="Crear nuevo documento." ma:contentTypeScope="" ma:versionID="427fde5a279d9f9dc3b9fa91a56bdd57">
   <xsd:schema xmlns:xsd="http://www.w3.org/2001/XMLSchema" xmlns:xs="http://www.w3.org/2001/XMLSchema" xmlns:p="http://schemas.microsoft.com/office/2006/metadata/properties" xmlns:ns2="7f48dc74-810e-4597-a58e-28cb4ccb6405" xmlns:ns3="cfbdc990-d511-4af6-b9b1-fc96925cdde4" targetNamespace="http://schemas.microsoft.com/office/2006/metadata/properties" ma:root="true" ma:fieldsID="2c265a2928579b9ed418c0a31077ec14" ns2:_="" ns3:_="">
     <xsd:import namespace="7f48dc74-810e-4597-a58e-28cb4ccb6405"/>
@@ -11550,30 +11821,35 @@
 </ct:contentTypeSchema>
 </file>
 
+<file path=customXml/item3.xml><?xml version="1.0" encoding="utf-8"?>
+<?mso-contentType ?>
+<FormTemplates xmlns="http://schemas.microsoft.com/sharepoint/v3/contenttype/forms">
+  <Display>DocumentLibraryForm</Display>
+  <Edit>DocumentLibraryForm</Edit>
+  <New>DocumentLibraryForm</New>
+</FormTemplates>
+</file>
+
 <file path=customXml/item4.xml><?xml version="1.0" encoding="utf-8"?>
-<b:Sources xmlns:b="http://schemas.openxmlformats.org/officeDocument/2006/bibliography" xmlns="http://schemas.openxmlformats.org/officeDocument/2006/bibliography" SelectedStyle="\APASixthEditionOfficeOnline.xsl" StyleName="APA" Version="6"/>
+<p:properties xmlns:p="http://schemas.microsoft.com/office/2006/metadata/properties" xmlns:xsi="http://www.w3.org/2001/XMLSchema-instance" xmlns:pc="http://schemas.microsoft.com/office/infopath/2007/PartnerControls">
+  <documentManagement>
+    <lcf76f155ced4ddcb4097134ff3c332f xmlns="7f48dc74-810e-4597-a58e-28cb4ccb6405">
+      <Terms xmlns="http://schemas.microsoft.com/office/infopath/2007/PartnerControls"/>
+    </lcf76f155ced4ddcb4097134ff3c332f>
+    <TaxCatchAll xmlns="cfbdc990-d511-4af6-b9b1-fc96925cdde4" xsi:nil="true"/>
+  </documentManagement>
+</p:properties>
 </file>
 
 <file path=customXml/itemProps1.xml><?xml version="1.0" encoding="utf-8"?>
-<ds:datastoreItem xmlns:ds="http://schemas.openxmlformats.org/officeDocument/2006/customXml" ds:itemID="{B6FB8993-579F-4DED-9164-261DF16F17BC}">
+<ds:datastoreItem xmlns:ds="http://schemas.openxmlformats.org/officeDocument/2006/customXml" ds:itemID="{719C53C8-6477-46F0-91B2-9F1066145A2E}">
   <ds:schemaRefs>
-    <ds:schemaRef ds:uri="http://schemas.microsoft.com/office/2006/metadata/properties"/>
-    <ds:schemaRef ds:uri="http://schemas.microsoft.com/office/infopath/2007/PartnerControls"/>
-    <ds:schemaRef ds:uri="7f48dc74-810e-4597-a58e-28cb4ccb6405"/>
-    <ds:schemaRef ds:uri="cfbdc990-d511-4af6-b9b1-fc96925cdde4"/>
+    <ds:schemaRef ds:uri="http://schemas.openxmlformats.org/officeDocument/2006/bibliography"/>
   </ds:schemaRefs>
 </ds:datastoreItem>
 </file>
 
 <file path=customXml/itemProps2.xml><?xml version="1.0" encoding="utf-8"?>
-<ds:datastoreItem xmlns:ds="http://schemas.openxmlformats.org/officeDocument/2006/customXml" ds:itemID="{1A078964-D09C-44B4-8577-FC6AF74D9725}">
-  <ds:schemaRefs>
-    <ds:schemaRef ds:uri="http://schemas.microsoft.com/sharepoint/v3/contenttype/forms"/>
-  </ds:schemaRefs>
-</ds:datastoreItem>
-</file>
-
-<file path=customXml/itemProps3.xml><?xml version="1.0" encoding="utf-8"?>
 <ds:datastoreItem xmlns:ds="http://schemas.openxmlformats.org/officeDocument/2006/customXml" ds:itemID="{DC2DA9BF-20F1-4879-B2E8-D8D14265C4BC}">
   <ds:schemaRefs>
     <ds:schemaRef ds:uri="http://schemas.microsoft.com/office/2006/metadata/contentType"/>
@@ -11592,10 +11868,21 @@
 </ds:datastoreItem>
 </file>
 
+<file path=customXml/itemProps3.xml><?xml version="1.0" encoding="utf-8"?>
+<ds:datastoreItem xmlns:ds="http://schemas.openxmlformats.org/officeDocument/2006/customXml" ds:itemID="{1A078964-D09C-44B4-8577-FC6AF74D9725}">
+  <ds:schemaRefs>
+    <ds:schemaRef ds:uri="http://schemas.microsoft.com/sharepoint/v3/contenttype/forms"/>
+  </ds:schemaRefs>
+</ds:datastoreItem>
+</file>
+
 <file path=customXml/itemProps4.xml><?xml version="1.0" encoding="utf-8"?>
-<ds:datastoreItem xmlns:ds="http://schemas.openxmlformats.org/officeDocument/2006/customXml" ds:itemID="{719C53C8-6477-46F0-91B2-9F1066145A2E}">
+<ds:datastoreItem xmlns:ds="http://schemas.openxmlformats.org/officeDocument/2006/customXml" ds:itemID="{B6FB8993-579F-4DED-9164-261DF16F17BC}">
   <ds:schemaRefs>
-    <ds:schemaRef ds:uri="http://schemas.openxmlformats.org/officeDocument/2006/bibliography"/>
+    <ds:schemaRef ds:uri="http://schemas.microsoft.com/office/2006/metadata/properties"/>
+    <ds:schemaRef ds:uri="http://schemas.microsoft.com/office/infopath/2007/PartnerControls"/>
+    <ds:schemaRef ds:uri="7f48dc74-810e-4597-a58e-28cb4ccb6405"/>
+    <ds:schemaRef ds:uri="cfbdc990-d511-4af6-b9b1-fc96925cdde4"/>
   </ds:schemaRefs>
 </ds:datastoreItem>
 </file>
</xml_diff>